<commit_message>
chapter draft with 16s data writing and editing writing
</commit_message>
<xml_diff>
--- a/writing/2025-03-17_introduction_notes.docx
+++ b/writing/2025-03-17_introduction_notes.docx
@@ -515,6 +515,15 @@
       <w:r>
         <w:t xml:space="preserve"> changes in gut or direct effects of temp on hot physiology </w:t>
       </w:r>
+      <w:bookmarkStart w:id="0" w:name="ZOTERO_TEMP_BOOKMARK"/>
+      <w:r>
+        <w:rPr>
+          <w:rFonts w:ascii="Times New Roman" w:hAnsi="Times New Roman" w:cs="Times New Roman"/>
+          <w:kern w:val="0"/>
+        </w:rPr>
+        <w:t>(Horváthová et al., 2019)</w:t>
+      </w:r>
+      <w:bookmarkEnd w:id="0"/>
       <w:r>
         <w:fldChar w:fldCharType="begin"/>
       </w:r>
@@ -2167,6 +2176,24 @@
       </w:r>
     </w:p>
     <w:p/>
+    <w:p>
+      <w:r>
+        <w:t xml:space="preserve">Round and </w:t>
+      </w:r>
+      <w:proofErr w:type="spellStart"/>
+      <w:r>
+        <w:t>mazamniam</w:t>
+      </w:r>
+      <w:proofErr w:type="spellEnd"/>
+      <w:r>
+        <w:t xml:space="preserve"> 2009 – axis may cause </w:t>
+      </w:r>
+      <w:proofErr w:type="spellStart"/>
+      <w:r>
+        <w:t>diesaes</w:t>
+      </w:r>
+      <w:proofErr w:type="spellEnd"/>
+    </w:p>
     <w:p/>
     <w:p/>
     <w:p>
@@ -2285,6 +2312,7 @@
     </w:p>
     <w:p>
       <w:r>
+        <w:lastRenderedPageBreak/>
         <w:t xml:space="preserve">Potential physiological consequences? </w:t>
       </w:r>
     </w:p>
@@ -2297,7 +2325,6 @@
         </w:numPr>
       </w:pPr>
       <w:r>
-        <w:lastRenderedPageBreak/>
         <w:t xml:space="preserve">Do </w:t>
       </w:r>
       <w:proofErr w:type="spellStart"/>

</xml_diff>